<commit_message>
Documenta o motor único, cria a CI manual e mostra rótulos em português
- README do design system: PDF só pelo ReportLab, sem bibliotecas do sistema.
- .github/workflows/tests.yml com acionamento manual (3 sistemas x 2 Pythons).
- Layout Studio e folha de comparação mostram os rótulos em português.
- Amostra briefing_one_page com título que cabe em uma página.
- Plano 036 concluído; 031 superado.

Co-Authored-By: Claude Opus 5.5 <noreply@anthropic.com>
</commit_message>
<xml_diff>
--- a/_SAMPLES_ENTREGAVEIS/briefing/sample-briefing-v1.0.0.docx
+++ b/_SAMPLES_ENTREGAVEIS/briefing/sample-briefing-v1.0.0.docx
@@ -8,6 +8,15 @@
       </w:pPr>
       <w:r>
         <w:t>EXEMPLO FICTÍCIO — Melhorar a experiencia de solicitacoes internas</w:t>
+      </w:r>
+    </w:p>
+    <w:p>
+      <w:r>
+        <w:rPr>
+          <w:color w:val="586EA4"/>
+          <w:sz w:val="15"/>
+        </w:rPr>
+        <w:t>ID sample-briefing · versão 1.0.0 · Completo</w:t>
       </w:r>
     </w:p>
     <w:p>

</xml_diff>

<commit_message>
Desenha o resumo do briefing nos blocos do Layout Studio
- PDF do executive_one_page segue o briefing_one_page.layout.json: cabeçalho
  acima do título, HMW sem subtítulo em largura total, problema, relevância e
  resultados em três colunas com subtítulo, pessoas e rodapé com fontes. Sem o
  bloco genérico 'Notas'. Bloco que não cabe na sua área é recusado.
- Campos técnicos aparecem com rótulos em português (Pontos, Responsáveis,
  Patrocinador...) em todos os formatos.
- Amostra com acentos corrigidos; 18 amostras regeneradas; teste novo da
  segmentação, que falha no renderizador anterior.

Co-Authored-By: Claude Opus 5.5 <noreply@anthropic.com>
</commit_message>
<xml_diff>
--- a/_SAMPLES_ENTREGAVEIS/briefing/sample-briefing-v1.0.0.docx
+++ b/_SAMPLES_ENTREGAVEIS/briefing/sample-briefing-v1.0.0.docx
@@ -85,7 +85,7 @@
               <w:br/>
               <w:t>As solicitacoes chegam por canais diferentes e sem informacoes padronizadas, gerando retrabalho para solicitantes e equipes de atendimento.</w:t>
               <w:br/>
-              <w:t>Points: As fontes fornecidas relatam duplicidade de pedidos.; O prazo de atendimento nao e visivel para quem solicita.</w:t>
+              <w:t>Pontos: As fontes fornecidas relatam duplicidade de pedidos.; O prazo de atendimento nao e visivel para quem solicita.</w:t>
             </w:r>
           </w:p>
         </w:tc>
@@ -117,7 +117,7 @@
               <w:br/>
               <w:t>O problema consome capacidade operacional e reduz a confianca no processo interno.</w:t>
               <w:br/>
-              <w:t>Points: A melhoria esta ligada a eficiencia operacional descrita nas fontes.; A previsibilidade influencia a experiencia das equipes envolvidas.</w:t>
+              <w:t>Pontos: A melhoria esta ligada a eficiencia operacional descrita nas fontes.; A previsibilidade influencia a experiencia das equipes envolvidas.</w:t>
             </w:r>
           </w:p>
         </w:tc>
@@ -149,7 +149,7 @@
               <w:br/>
               <w:t>Reduzir retrabalho e tornar o andamento das solicitacoes compreensivel.</w:t>
               <w:br/>
-              <w:t>Points: Diminuir solicitacoes devolvidas por falta de informacao.; Permitir acompanhamento de status pelo solicitante.</w:t>
+              <w:t>Pontos: Diminuir solicitacoes devolvidas por falta de informacao.; Permitir acompanhamento de status pelo solicitante.</w:t>
             </w:r>
           </w:p>
         </w:tc>
@@ -179,7 +179,7 @@
             <w:r>
               <w:t>Responsavel ainda nao identificado nas fontes.</w:t>
               <w:br/>
-              <w:t>Name: Nao informado</w:t>
+              <w:t>Nome: Nao informado</w:t>
             </w:r>
           </w:p>
         </w:tc>
@@ -209,7 +209,7 @@
             <w:r>
               <w:t>Sponsor ainda nao identificado nas fontes.</w:t>
               <w:br/>
-              <w:t>Name: Nao informado</w:t>
+              <w:t>Nome: Nao informado</w:t>
             </w:r>
           </w:p>
         </w:tc>

</xml_diff>

<commit_message>
Renomeia entregas da skill de briefing e alinha IQB
</commit_message>
<xml_diff>
--- a/_SAMPLES_ENTREGAVEIS/briefing/sample-briefing-v1.0.0.docx
+++ b/_SAMPLES_ENTREGAVEIS/briefing/sample-briefing-v1.0.0.docx
@@ -21,7 +21,7 @@
     </w:p>
     <w:p>
       <w:r>
-        <w:t>Amostra fictícia do formato original RC6. Não descreve um projeto real. Briefing estruturado do desafio usado como exemplo neutro do contrato canonico.</w:t>
+        <w:t>Amostra fictícia do formato original RC6. Não descreve um projeto real. Entrevista Inicial de sete campos usada como exemplo neutro do contrato canônico.</w:t>
       </w:r>
     </w:p>
     <w:p>
@@ -251,6 +251,9 @@
       <w:pStyle w:val="Header"/>
       <w:jc w:val="right"/>
     </w:pPr>
+    <w:r>
+      <w:t xml:space="preserve">ENTREVISTA INICIAL DE SETE CAMPOS    </w:t>
+    </w:r>
     <w:r>
       <w:drawing>
         <wp:inline xmlns:a="http://schemas.openxmlformats.org/drawingml/2006/main" xmlns:pic="http://schemas.openxmlformats.org/drawingml/2006/picture">

</xml_diff>

<commit_message>
feat(docx): align editable deliverables with PDF layouts
</commit_message>
<xml_diff>
--- a/_SAMPLES_ENTREGAVEIS/briefing/sample-briefing-v1.0.0.docx
+++ b/_SAMPLES_ENTREGAVEIS/briefing/sample-briefing-v1.0.0.docx
@@ -4,15 +4,83 @@
   <w:body>
     <w:p>
       <w:pPr>
-        <w:pStyle w:val="Title"/>
+        <w:tabs>
+          <w:tab w:pos="10092" w:val="right"/>
+        </w:tabs>
+        <w:spacing w:line="560" w:lineRule="exact"/>
+        <w:pBdr>
+          <w:bottom w:val="single" w:sz="12" w:color="193C8E"/>
+        </w:pBdr>
       </w:pPr>
       <w:r>
+        <w:rPr>
+          <w:rFonts w:ascii="Montserrat" w:hAnsi="Montserrat" w:eastAsia="Montserrat" w:cs="Montserrat"/>
+          <w:b/>
+          <w:color w:val="4C73D1"/>
+          <w:sz w:val="16"/>
+        </w:rPr>
+        <w:t>ENTREVISTA INICIAL DE SETE CAMPOS</w:t>
+      </w:r>
+      <w:r>
+        <w:tab/>
+        <w:drawing>
+          <wp:inline xmlns:a="http://schemas.openxmlformats.org/drawingml/2006/main" xmlns:pic="http://schemas.openxmlformats.org/drawingml/2006/picture">
+            <wp:extent cx="1080000" cy="404885"/>
+            <wp:docPr id="1" name="Picture 1"/>
+            <wp:cNvGraphicFramePr>
+              <a:graphicFrameLocks noChangeAspect="1"/>
+            </wp:cNvGraphicFramePr>
+            <a:graphic>
+              <a:graphicData uri="http://schemas.openxmlformats.org/drawingml/2006/picture">
+                <pic:pic>
+                  <pic:nvPicPr>
+                    <pic:cNvPr id="0" name="logo_ccee.png"/>
+                    <pic:cNvPicPr/>
+                  </pic:nvPicPr>
+                  <pic:blipFill>
+                    <a:blip r:embed="rId9"/>
+                    <a:stretch>
+                      <a:fillRect/>
+                    </a:stretch>
+                  </pic:blipFill>
+                  <pic:spPr>
+                    <a:xfrm>
+                      <a:off x="0" y="0"/>
+                      <a:ext cx="1080000" cy="404885"/>
+                    </a:xfrm>
+                    <a:prstGeom prst="rect"/>
+                  </pic:spPr>
+                </pic:pic>
+              </a:graphicData>
+            </a:graphic>
+          </wp:inline>
+        </w:drawing>
+      </w:r>
+    </w:p>
+    <w:p>
+      <w:pPr>
+        <w:pStyle w:val="Title"/>
+        <w:spacing w:before="160" w:after="120"/>
+      </w:pPr>
+      <w:r>
+        <w:rPr>
+          <w:rFonts w:ascii="Montserrat" w:hAnsi="Montserrat" w:eastAsia="Montserrat" w:cs="Montserrat"/>
+          <w:b/>
+          <w:color w:val="193C8E"/>
+          <w:sz w:val="50"/>
+        </w:rPr>
         <w:t>EXEMPLO FICTÍCIO: Melhorar a experiencia de solicitacoes internas</w:t>
       </w:r>
     </w:p>
     <w:p>
+      <w:pPr>
+        <w:spacing w:before="0" w:after="100" w:line="165" w:lineRule="exact"/>
+      </w:pPr>
+      <w:r/>
       <w:r>
         <w:rPr>
+          <w:rFonts w:ascii="Montserrat" w:hAnsi="Montserrat" w:eastAsia="Montserrat" w:cs="Montserrat"/>
+          <w:b w:val="0"/>
           <w:color w:val="586EA4"/>
           <w:sz w:val="15"/>
         </w:rPr>
@@ -20,25 +88,45 @@
       </w:r>
     </w:p>
     <w:p>
+      <w:pPr>
+        <w:spacing w:before="0" w:after="0" w:line="283" w:lineRule="exact"/>
+      </w:pPr>
+      <w:r/>
       <w:r>
+        <w:rPr>
+          <w:rFonts w:ascii="Montserrat" w:hAnsi="Montserrat" w:eastAsia="Montserrat" w:cs="Montserrat"/>
+          <w:b w:val="0"/>
+          <w:color w:val="102661"/>
+          <w:sz w:val="21"/>
+        </w:rPr>
         <w:t>Amostra fictícia do formato original RC6. Não descreve um projeto real. Entrevista Inicial de sete campos usada como exemplo neutro do contrato canônico.</w:t>
       </w:r>
     </w:p>
     <w:p>
       <w:pPr>
         <w:pStyle w:val="Heading1"/>
+        <w:spacing w:before="200" w:after="140" w:line="264" w:lineRule="exact"/>
         <w:shd w:fill="102661"/>
       </w:pPr>
       <w:r>
         <w:rPr>
+          <w:caps/>
           <w:color w:val="FFFFFF"/>
+        </w:rPr>
+      </w:r>
+      <w:r>
+        <w:rPr>
+          <w:rFonts w:ascii="Montserrat" w:hAnsi="Montserrat" w:eastAsia="Montserrat" w:cs="Montserrat"/>
+          <w:b/>
+          <w:caps/>
+          <w:color w:val="FFFFFF"/>
+          <w:sz w:val="22"/>
         </w:rPr>
         <w:t>Melhorar a experiencia de solicitacoes internas</w:t>
       </w:r>
     </w:p>
     <w:tbl>
       <w:tblPr>
-        <w:tblStyle w:val="TableGrid"/>
         <w:tblW w:type="auto" w:w="0"/>
         <w:tblLook w:firstColumn="1" w:firstRow="1" w:lastColumn="0" w:lastRow="0" w:noHBand="0" w:noVBand="1" w:val="04A0"/>
       </w:tblPr>
@@ -49,10 +137,29 @@
         <w:tc>
           <w:tcPr>
             <w:tcW w:type="dxa" w:w="10092"/>
-            <w:shd w:fill="F3F5FA"/>
+            <w:shd w:fill="102661"/>
+            <w:tcBorders>
+              <w:start w:val="single" w:sz="24" w:color="4C73D1"/>
+            </w:tcBorders>
+            <w:tcMar>
+              <w:top w:w="160" w:type="dxa"/>
+              <w:start w:w="180" w:type="dxa"/>
+              <w:bottom w:w="160" w:type="dxa"/>
+              <w:end w:w="180" w:type="dxa"/>
+            </w:tcMar>
           </w:tcPr>
           <w:p>
+            <w:pPr>
+              <w:spacing w:before="0" w:after="0" w:line="256" w:lineRule="exact"/>
+            </w:pPr>
+            <w:r/>
             <w:r>
+              <w:rPr>
+                <w:rFonts w:ascii="Montserrat" w:hAnsi="Montserrat" w:eastAsia="Montserrat" w:cs="Montserrat"/>
+                <w:b w:val="0"/>
+                <w:color w:val="FFFFFF"/>
+                <w:sz w:val="19"/>
+              </w:rPr>
               <w:t>Como podemos reduzir o esforco de quem solicita e de quem atende para que as demandas sejam resolvidas com clareza de modo que o processo seja previsivel?</w:t>
             </w:r>
           </w:p>
@@ -60,236 +167,234 @@
       </w:tr>
     </w:tbl>
     <w:p>
+      <w:pPr>
+        <w:spacing w:before="0" w:after="0" w:line="208" w:lineRule="exact"/>
+      </w:pPr>
+      <w:r/>
       <w:r>
-        <w:t>Fontes: FIC-01</w:t>
-      </w:r>
-    </w:p>
-    <w:tbl>
-      <w:tblPr>
-        <w:tblStyle w:val="TableGrid"/>
-        <w:tblW w:type="auto" w:w="0"/>
-        <w:tblLook w:firstColumn="1" w:firstRow="1" w:lastColumn="0" w:lastRow="0" w:noHBand="0" w:noVBand="1" w:val="04A0"/>
-      </w:tblPr>
-      <w:tblGrid>
-        <w:gridCol w:w="10092"/>
-      </w:tblGrid>
-      <w:tr>
-        <w:tc>
-          <w:tcPr>
-            <w:tcW w:type="dxa" w:w="10092"/>
-            <w:shd w:fill="F3F5FA"/>
-          </w:tcPr>
-          <w:p>
-            <w:r>
-              <w:t>Descricao detalhada do problema ou oportunidade</w:t>
-              <w:br/>
-              <w:t>As solicitacoes chegam por canais diferentes e sem informacoes padronizadas, gerando retrabalho para solicitantes e equipes de atendimento.</w:t>
-              <w:br/>
-              <w:t>Pontos: As fontes fornecidas relatam duplicidade de pedidos.; O prazo de atendimento nao e visivel para quem solicita.</w:t>
-            </w:r>
-          </w:p>
-        </w:tc>
-      </w:tr>
-    </w:tbl>
-    <w:p>
-      <w:r>
-        <w:t>Fontes: FIC-01</w:t>
-      </w:r>
-    </w:p>
-    <w:tbl>
-      <w:tblPr>
-        <w:tblStyle w:val="TableGrid"/>
-        <w:tblW w:type="auto" w:w="0"/>
-        <w:tblLook w:firstColumn="1" w:firstRow="1" w:lastColumn="0" w:lastRow="0" w:noHBand="0" w:noVBand="1" w:val="04A0"/>
-      </w:tblPr>
-      <w:tblGrid>
-        <w:gridCol w:w="10092"/>
-      </w:tblGrid>
-      <w:tr>
-        <w:tc>
-          <w:tcPr>
-            <w:tcW w:type="dxa" w:w="10092"/>
-            <w:shd w:fill="F3F5FA"/>
-          </w:tcPr>
-          <w:p>
-            <w:r>
-              <w:t>Justificativa da relevancia</w:t>
-              <w:br/>
-              <w:t>O problema consome capacidade operacional e reduz a confianca no processo interno.</w:t>
-              <w:br/>
-              <w:t>Pontos: A melhoria esta ligada a eficiencia operacional descrita nas fontes.; A previsibilidade influencia a experiencia das equipes envolvidas.</w:t>
-            </w:r>
-          </w:p>
-        </w:tc>
-      </w:tr>
-    </w:tbl>
-    <w:p>
-      <w:r>
-        <w:t>Fontes: FIC-01</w:t>
-      </w:r>
-    </w:p>
-    <w:tbl>
-      <w:tblPr>
-        <w:tblStyle w:val="TableGrid"/>
-        <w:tblW w:type="auto" w:w="0"/>
-        <w:tblLook w:firstColumn="1" w:firstRow="1" w:lastColumn="0" w:lastRow="0" w:noHBand="0" w:noVBand="1" w:val="04A0"/>
-      </w:tblPr>
-      <w:tblGrid>
-        <w:gridCol w:w="10092"/>
-      </w:tblGrid>
-      <w:tr>
-        <w:tc>
-          <w:tcPr>
-            <w:tcW w:type="dxa" w:w="10092"/>
-            <w:shd w:fill="F3F5FA"/>
-          </w:tcPr>
-          <w:p>
-            <w:r>
-              <w:t>Resultados esperados</w:t>
-              <w:br/>
-              <w:t>Reduzir retrabalho e tornar o andamento das solicitacoes compreensivel.</w:t>
-              <w:br/>
-              <w:t>Pontos: Diminuir solicitacoes devolvidas por falta de informacao.; Permitir acompanhamento de status pelo solicitante.</w:t>
-            </w:r>
-          </w:p>
-        </w:tc>
-      </w:tr>
-    </w:tbl>
-    <w:p>
-      <w:r>
-        <w:t>Fontes: FIC-01</w:t>
-      </w:r>
-    </w:p>
-    <w:tbl>
-      <w:tblPr>
-        <w:tblStyle w:val="TableGrid"/>
-        <w:tblW w:type="auto" w:w="0"/>
-        <w:tblLook w:firstColumn="1" w:firstRow="1" w:lastColumn="0" w:lastRow="0" w:noHBand="0" w:noVBand="1" w:val="04A0"/>
-      </w:tblPr>
-      <w:tblGrid>
-        <w:gridCol w:w="10092"/>
-      </w:tblGrid>
-      <w:tr>
-        <w:tc>
-          <w:tcPr>
-            <w:tcW w:type="dxa" w:w="10092"/>
-            <w:shd w:fill="F3F5FA"/>
-          </w:tcPr>
-          <w:p>
-            <w:r>
-              <w:t>Responsavel ainda nao identificado nas fontes.</w:t>
-              <w:br/>
-              <w:t>Nome: Nao informado</w:t>
-            </w:r>
-          </w:p>
-        </w:tc>
-      </w:tr>
-    </w:tbl>
-    <w:p>
-      <w:r>
-        <w:t>Fontes: FIC-01</w:t>
-      </w:r>
-    </w:p>
-    <w:tbl>
-      <w:tblPr>
-        <w:tblStyle w:val="TableGrid"/>
-        <w:tblW w:type="auto" w:w="0"/>
-        <w:tblLook w:firstColumn="1" w:firstRow="1" w:lastColumn="0" w:lastRow="0" w:noHBand="0" w:noVBand="1" w:val="04A0"/>
-      </w:tblPr>
-      <w:tblGrid>
-        <w:gridCol w:w="10092"/>
-      </w:tblGrid>
-      <w:tr>
-        <w:tc>
-          <w:tcPr>
-            <w:tcW w:type="dxa" w:w="10092"/>
-            <w:shd w:fill="F3F5FA"/>
-          </w:tcPr>
-          <w:p>
-            <w:r>
-              <w:t>Sponsor ainda nao identificado nas fontes.</w:t>
-              <w:br/>
-              <w:t>Nome: Nao informado</w:t>
-            </w:r>
-          </w:p>
-        </w:tc>
-      </w:tr>
-    </w:tbl>
-    <w:p>
-      <w:r>
+        <w:rPr>
+          <w:rFonts w:ascii="Montserrat" w:hAnsi="Montserrat" w:eastAsia="Montserrat" w:cs="Montserrat"/>
+          <w:b w:val="0"/>
+          <w:color w:val="30343B"/>
+          <w:sz w:val="16"/>
+        </w:rPr>
         <w:t>Fontes: FIC-01</w:t>
       </w:r>
     </w:p>
     <w:p>
       <w:pPr>
-        <w:pStyle w:val="Heading1"/>
+        <w:spacing w:after="140" w:line="256" w:lineRule="exact"/>
       </w:pPr>
       <w:r>
+        <w:rPr>
+          <w:rFonts w:ascii="Montserrat" w:hAnsi="Montserrat" w:eastAsia="Montserrat" w:cs="Montserrat"/>
+          <w:b w:val="0"/>
+          <w:color w:val="30343B"/>
+          <w:sz w:val="19"/>
+        </w:rPr>
+        <w:t>Descricao detalhada do problema ou oportunidade</w:t>
+        <w:br/>
+        <w:t>As solicitacoes chegam por canais diferentes e sem informacoes padronizadas, gerando retrabalho para solicitantes e equipes de atendimento.</w:t>
+        <w:br/>
+        <w:t>Pontos: As fontes fornecidas relatam duplicidade de pedidos.; O prazo de atendimento nao e visivel para quem solicita.</w:t>
+      </w:r>
+    </w:p>
+    <w:p>
+      <w:pPr>
+        <w:spacing w:before="0" w:after="0" w:line="208" w:lineRule="exact"/>
+      </w:pPr>
+      <w:r/>
+      <w:r>
+        <w:rPr>
+          <w:rFonts w:ascii="Montserrat" w:hAnsi="Montserrat" w:eastAsia="Montserrat" w:cs="Montserrat"/>
+          <w:b w:val="0"/>
+          <w:color w:val="30343B"/>
+          <w:sz w:val="16"/>
+        </w:rPr>
+        <w:t>Fontes: FIC-01</w:t>
+      </w:r>
+    </w:p>
+    <w:p>
+      <w:pPr>
+        <w:spacing w:after="140" w:line="256" w:lineRule="exact"/>
+      </w:pPr>
+      <w:r>
+        <w:rPr>
+          <w:rFonts w:ascii="Montserrat" w:hAnsi="Montserrat" w:eastAsia="Montserrat" w:cs="Montserrat"/>
+          <w:b w:val="0"/>
+          <w:color w:val="30343B"/>
+          <w:sz w:val="19"/>
+        </w:rPr>
+        <w:t>Justificativa da relevancia</w:t>
+        <w:br/>
+        <w:t>O problema consome capacidade operacional e reduz a confianca no processo interno.</w:t>
+        <w:br/>
+        <w:t>Pontos: A melhoria esta ligada a eficiencia operacional descrita nas fontes.; A previsibilidade influencia a experiencia das equipes envolvidas.</w:t>
+      </w:r>
+    </w:p>
+    <w:p>
+      <w:pPr>
+        <w:spacing w:before="0" w:after="0" w:line="208" w:lineRule="exact"/>
+      </w:pPr>
+      <w:r/>
+      <w:r>
+        <w:rPr>
+          <w:rFonts w:ascii="Montserrat" w:hAnsi="Montserrat" w:eastAsia="Montserrat" w:cs="Montserrat"/>
+          <w:b w:val="0"/>
+          <w:color w:val="30343B"/>
+          <w:sz w:val="16"/>
+        </w:rPr>
+        <w:t>Fontes: FIC-01</w:t>
+      </w:r>
+    </w:p>
+    <w:p>
+      <w:pPr>
+        <w:spacing w:after="140" w:line="256" w:lineRule="exact"/>
+      </w:pPr>
+      <w:r>
+        <w:rPr>
+          <w:rFonts w:ascii="Montserrat" w:hAnsi="Montserrat" w:eastAsia="Montserrat" w:cs="Montserrat"/>
+          <w:b w:val="0"/>
+          <w:color w:val="30343B"/>
+          <w:sz w:val="19"/>
+        </w:rPr>
+        <w:t>Resultados esperados</w:t>
+        <w:br/>
+        <w:t>Reduzir retrabalho e tornar o andamento das solicitacoes compreensivel.</w:t>
+        <w:br/>
+        <w:t>Pontos: Diminuir solicitacoes devolvidas por falta de informacao.; Permitir acompanhamento de status pelo solicitante.</w:t>
+      </w:r>
+    </w:p>
+    <w:p>
+      <w:pPr>
+        <w:spacing w:before="0" w:after="0" w:line="208" w:lineRule="exact"/>
+      </w:pPr>
+      <w:r/>
+      <w:r>
+        <w:rPr>
+          <w:rFonts w:ascii="Montserrat" w:hAnsi="Montserrat" w:eastAsia="Montserrat" w:cs="Montserrat"/>
+          <w:b w:val="0"/>
+          <w:color w:val="30343B"/>
+          <w:sz w:val="16"/>
+        </w:rPr>
+        <w:t>Fontes: FIC-01</w:t>
+      </w:r>
+    </w:p>
+    <w:p>
+      <w:pPr>
+        <w:spacing w:after="140" w:line="256" w:lineRule="exact"/>
+      </w:pPr>
+      <w:r>
+        <w:rPr>
+          <w:rFonts w:ascii="Montserrat" w:hAnsi="Montserrat" w:eastAsia="Montserrat" w:cs="Montserrat"/>
+          <w:b w:val="0"/>
+          <w:color w:val="30343B"/>
+          <w:sz w:val="19"/>
+        </w:rPr>
+        <w:t>Responsavel ainda nao identificado nas fontes.</w:t>
+        <w:br/>
+        <w:t>Nome: Nao informado</w:t>
+      </w:r>
+    </w:p>
+    <w:p>
+      <w:pPr>
+        <w:spacing w:before="0" w:after="0" w:line="208" w:lineRule="exact"/>
+      </w:pPr>
+      <w:r/>
+      <w:r>
+        <w:rPr>
+          <w:rFonts w:ascii="Montserrat" w:hAnsi="Montserrat" w:eastAsia="Montserrat" w:cs="Montserrat"/>
+          <w:b w:val="0"/>
+          <w:color w:val="30343B"/>
+          <w:sz w:val="16"/>
+        </w:rPr>
+        <w:t>Fontes: FIC-01</w:t>
+      </w:r>
+    </w:p>
+    <w:p>
+      <w:pPr>
+        <w:spacing w:after="140" w:line="256" w:lineRule="exact"/>
+      </w:pPr>
+      <w:r>
+        <w:rPr>
+          <w:rFonts w:ascii="Montserrat" w:hAnsi="Montserrat" w:eastAsia="Montserrat" w:cs="Montserrat"/>
+          <w:b w:val="0"/>
+          <w:color w:val="30343B"/>
+          <w:sz w:val="19"/>
+        </w:rPr>
+        <w:t>Sponsor ainda nao identificado nas fontes.</w:t>
+        <w:br/>
+        <w:t>Nome: Nao informado</w:t>
+      </w:r>
+    </w:p>
+    <w:p>
+      <w:pPr>
+        <w:spacing w:before="0" w:after="0" w:line="208" w:lineRule="exact"/>
+      </w:pPr>
+      <w:r/>
+      <w:r>
+        <w:rPr>
+          <w:rFonts w:ascii="Montserrat" w:hAnsi="Montserrat" w:eastAsia="Montserrat" w:cs="Montserrat"/>
+          <w:b w:val="0"/>
+          <w:color w:val="30343B"/>
+          <w:sz w:val="16"/>
+        </w:rPr>
+        <w:t>Fontes: FIC-01</w:t>
+      </w:r>
+    </w:p>
+    <w:p>
+      <w:pPr>
+        <w:spacing w:before="0" w:after="160" w:line="256" w:lineRule="exact"/>
+      </w:pPr>
+      <w:r/>
+      <w:r>
+        <w:rPr>
+          <w:rFonts w:ascii="Montserrat" w:hAnsi="Montserrat" w:eastAsia="Montserrat" w:cs="Montserrat"/>
+          <w:b w:val="0"/>
+          <w:color w:val="30343B"/>
+          <w:sz w:val="19"/>
+        </w:rPr>
+      </w:r>
+    </w:p>
+    <w:p>
+      <w:pPr>
+        <w:pStyle w:val="Heading1"/>
+        <w:spacing w:before="0" w:after="0" w:line="312" w:lineRule="exact"/>
+      </w:pPr>
+      <w:r/>
+      <w:r>
+        <w:rPr>
+          <w:rFonts w:ascii="Montserrat" w:hAnsi="Montserrat" w:eastAsia="Montserrat" w:cs="Montserrat"/>
+          <w:b/>
+          <w:color w:val="193C8E"/>
+          <w:sz w:val="26"/>
+        </w:rPr>
         <w:t>Fontes</w:t>
       </w:r>
     </w:p>
     <w:p>
+      <w:pPr>
+        <w:spacing w:before="0" w:after="0" w:line="208" w:lineRule="exact"/>
+      </w:pPr>
+      <w:r/>
       <w:r>
+        <w:rPr>
+          <w:rFonts w:ascii="Montserrat" w:hAnsi="Montserrat" w:eastAsia="Montserrat" w:cs="Montserrat"/>
+          <w:b w:val="0"/>
+          <w:color w:val="30343B"/>
+          <w:sz w:val="16"/>
+        </w:rPr>
         <w:t>FIC-01: ata-simulada-5c exemplo fictício, sem coleta real</w:t>
       </w:r>
     </w:p>
     <w:sectPr>
-      <w:headerReference w:type="default" r:id="rId9"/>
       <w:pgSz w:w="11906" w:h="16838"/>
-      <w:pgMar w:top="907" w:right="907" w:bottom="907" w:left="907" w:header="720" w:footer="720" w:gutter="0"/>
+      <w:pgMar w:top="907" w:right="907" w:bottom="907" w:left="907" w:header="113" w:footer="283" w:gutter="0"/>
       <w:cols w:space="720"/>
       <w:docGrid w:linePitch="360"/>
     </w:sectPr>
   </w:body>
 </w:document>
-</file>
-
-<file path=word/header1.xml><?xml version="1.0" encoding="utf-8"?>
-<w:hdr xmlns:m="http://schemas.openxmlformats.org/officeDocument/2006/math" xmlns:mc="http://schemas.openxmlformats.org/markup-compatibility/2006" xmlns:mo="http://schemas.microsoft.com/office/mac/office/2008/main" xmlns:mv="urn:schemas-microsoft-com:mac:vml" xmlns:o="urn:schemas-microsoft-com:office:office" xmlns:r="http://schemas.openxmlformats.org/officeDocument/2006/relationships" xmlns:v="urn:schemas-microsoft-com:vml" xmlns:w10="urn:schemas-microsoft-com:office:word" xmlns:w14="http://schemas.microsoft.com/office/word/2010/wordml" xmlns:w="http://schemas.openxmlformats.org/wordprocessingml/2006/main" xmlns:wne="http://schemas.microsoft.com/office/word/2006/wordml" xmlns:wp14="http://schemas.microsoft.com/office/word/2010/wordprocessingDrawing" xmlns:wp="http://schemas.openxmlformats.org/drawingml/2006/wordprocessingDrawing" xmlns:wpc="http://schemas.microsoft.com/office/word/2010/wordprocessingCanvas" xmlns:wpg="http://schemas.microsoft.com/office/word/2010/wordprocessingGroup" xmlns:wpi="http://schemas.microsoft.com/office/word/2010/wordprocessingInk" xmlns:wps="http://schemas.microsoft.com/office/word/2010/wordprocessingShape" mc:Ignorable="w14 wp14">
-  <w:p>
-    <w:pPr>
-      <w:pStyle w:val="Header"/>
-      <w:jc w:val="right"/>
-    </w:pPr>
-    <w:r>
-      <w:t xml:space="preserve">ENTREVISTA INICIAL DE SETE CAMPOS    </w:t>
-    </w:r>
-    <w:r>
-      <w:drawing>
-        <wp:inline xmlns:a="http://schemas.openxmlformats.org/drawingml/2006/main" xmlns:pic="http://schemas.openxmlformats.org/drawingml/2006/picture">
-          <wp:extent cx="1152000" cy="431878"/>
-          <wp:docPr id="1" name="Picture 1"/>
-          <wp:cNvGraphicFramePr>
-            <a:graphicFrameLocks noChangeAspect="1"/>
-          </wp:cNvGraphicFramePr>
-          <a:graphic>
-            <a:graphicData uri="http://schemas.openxmlformats.org/drawingml/2006/picture">
-              <pic:pic>
-                <pic:nvPicPr>
-                  <pic:cNvPr id="0" name="logo_ccee.png"/>
-                  <pic:cNvPicPr/>
-                </pic:nvPicPr>
-                <pic:blipFill>
-                  <a:blip r:embed="rId1"/>
-                  <a:stretch>
-                    <a:fillRect/>
-                  </a:stretch>
-                </pic:blipFill>
-                <pic:spPr>
-                  <a:xfrm>
-                    <a:off x="0" y="0"/>
-                    <a:ext cx="1152000" cy="431878"/>
-                  </a:xfrm>
-                  <a:prstGeom prst="rect"/>
-                </pic:spPr>
-              </pic:pic>
-            </a:graphicData>
-          </a:graphic>
-        </wp:inline>
-      </w:drawing>
-    </w:r>
-  </w:p>
-</w:hdr>
 </file>
 
 <file path=word/numbering.xml><?xml version="1.0" encoding="utf-8"?>
@@ -655,6 +760,9 @@
     <w:name w:val="Normal"/>
     <w:qFormat/>
     <w:rsid w:val="00FC693F"/>
+    <w:pPr>
+      <w:spacing w:after="0" w:line="256" w:lineRule="exact"/>
+    </w:pPr>
     <w:rPr>
       <w:rFonts w:ascii="Montserrat" w:hAnsi="Montserrat"/>
       <w:sz w:val="19"/>
@@ -723,7 +831,7 @@
       <w:b/>
       <w:bCs/>
       <w:color w:val="193C8E"/>
-      <w:sz w:val="28"/>
+      <w:sz w:val="22"/>
       <w:szCs w:val="28"/>
     </w:rPr>
   </w:style>
@@ -1009,10 +1117,11 @@
     </w:pPr>
     <w:rPr>
       <w:rFonts w:asciiTheme="majorHAnsi" w:eastAsiaTheme="majorEastAsia" w:hAnsiTheme="majorHAnsi" w:cstheme="majorBidi" w:ascii="Montserrat" w:hAnsi="Montserrat"/>
+      <w:b/>
       <w:color w:val="193C8E"/>
       <w:spacing w:val="5"/>
       <w:kern w:val="28"/>
-      <w:sz w:val="52"/>
+      <w:sz w:val="60"/>
       <w:szCs w:val="52"/>
     </w:rPr>
   </w:style>

</xml_diff>

<commit_message>
fix(docx): prevent CCEE logo clipping
</commit_message>
<xml_diff>
--- a/_SAMPLES_ENTREGAVEIS/briefing/sample-briefing-v1.0.0.docx
+++ b/_SAMPLES_ENTREGAVEIS/briefing/sample-briefing-v1.0.0.docx
@@ -7,7 +7,7 @@
         <w:tabs>
           <w:tab w:pos="10092" w:val="right"/>
         </w:tabs>
-        <w:spacing w:line="560" w:lineRule="exact"/>
+        <w:spacing w:line="720" w:lineRule="exact"/>
         <w:pBdr>
           <w:bottom w:val="single" w:sz="12" w:color="193C8E"/>
         </w:pBdr>
@@ -60,7 +60,7 @@
     <w:p>
       <w:pPr>
         <w:pStyle w:val="Title"/>
-        <w:spacing w:before="160" w:after="120"/>
+        <w:spacing w:before="0" w:after="120"/>
       </w:pPr>
       <w:r>
         <w:rPr>

</xml_diff>

<commit_message>
fix(docx): add padding to blue section bands
</commit_message>
<xml_diff>
--- a/_SAMPLES_ENTREGAVEIS/briefing/sample-briefing-v1.0.0.docx
+++ b/_SAMPLES_ENTREGAVEIS/briefing/sample-briefing-v1.0.0.docx
@@ -105,6 +105,9 @@
     <w:p>
       <w:pPr>
         <w:pStyle w:val="Heading1"/>
+        <w:tabs>
+          <w:tab w:pos="240" w:val="left"/>
+        </w:tabs>
         <w:spacing w:before="200" w:after="140" w:line="264" w:lineRule="exact"/>
         <w:shd w:fill="102661"/>
       </w:pPr>
@@ -113,6 +116,7 @@
           <w:caps/>
           <w:color w:val="FFFFFF"/>
         </w:rPr>
+        <w:tab/>
       </w:r>
       <w:r>
         <w:rPr>

</xml_diff>

<commit_message>
fix(docx): center padded section bands across deliverables
</commit_message>
<xml_diff>
--- a/_SAMPLES_ENTREGAVEIS/briefing/sample-briefing-v1.0.0.docx
+++ b/_SAMPLES_ENTREGAVEIS/briefing/sample-briefing-v1.0.0.docx
@@ -110,6 +110,10 @@
         </w:tabs>
         <w:spacing w:before="200" w:after="140" w:line="264" w:lineRule="exact"/>
         <w:shd w:fill="102661"/>
+        <w:pBdr>
+          <w:top w:val="single" w:sz="72" w:color="102661" w:space="0"/>
+          <w:bottom w:val="single" w:sz="72" w:color="102661" w:space="0"/>
+        </w:pBdr>
       </w:pPr>
       <w:r>
         <w:rPr>
@@ -299,12 +303,6 @@
         <w:br/>
         <w:t>Nome: Nao informado</w:t>
       </w:r>
-    </w:p>
-    <w:p>
-      <w:pPr>
-        <w:spacing w:before="0" w:after="0" w:line="208" w:lineRule="exact"/>
-      </w:pPr>
-      <w:r/>
       <w:r>
         <w:rPr>
           <w:rFonts w:ascii="Montserrat" w:hAnsi="Montserrat" w:eastAsia="Montserrat" w:cs="Montserrat"/>
@@ -312,7 +310,7 @@
           <w:color w:val="30343B"/>
           <w:sz w:val="16"/>
         </w:rPr>
-        <w:t>Fontes: FIC-01</w:t>
+        <w:t>[FIC-01]</w:t>
       </w:r>
     </w:p>
     <w:p>
@@ -330,12 +328,6 @@
         <w:br/>
         <w:t>Nome: Nao informado</w:t>
       </w:r>
-    </w:p>
-    <w:p>
-      <w:pPr>
-        <w:spacing w:before="0" w:after="0" w:line="208" w:lineRule="exact"/>
-      </w:pPr>
-      <w:r/>
       <w:r>
         <w:rPr>
           <w:rFonts w:ascii="Montserrat" w:hAnsi="Montserrat" w:eastAsia="Montserrat" w:cs="Montserrat"/>
@@ -343,22 +335,13 @@
           <w:color w:val="30343B"/>
           <w:sz w:val="16"/>
         </w:rPr>
-        <w:t>Fontes: FIC-01</w:t>
+        <w:t>[FIC-01]</w:t>
       </w:r>
     </w:p>
     <w:p>
       <w:pPr>
-        <w:spacing w:before="0" w:after="160" w:line="256" w:lineRule="exact"/>
+        <w:spacing w:line="20" w:lineRule="exact" w:after="180"/>
       </w:pPr>
-      <w:r/>
-      <w:r>
-        <w:rPr>
-          <w:rFonts w:ascii="Montserrat" w:hAnsi="Montserrat" w:eastAsia="Montserrat" w:cs="Montserrat"/>
-          <w:b w:val="0"/>
-          <w:color w:val="30343B"/>
-          <w:sz w:val="19"/>
-        </w:rPr>
-      </w:r>
     </w:p>
     <w:p>
       <w:pPr>

</xml_diff>